<commit_message>
Update Google Forms links
</commit_message>
<xml_diff>
--- a/Психологический_центр_готово/08_Практика_7_Анкетирование/Практика7_Анкетирование_отчет.docx
+++ b/Психологический_центр_готово/08_Практика_7_Анкетирование/Практика7_Анкетирование_отчет.docx
@@ -137,7 +137,7 @@
         <w:pStyle w:val="ListNumber"/>
       </w:pPr>
       <w:r>
-        <w:t>Опубликовать форму и вставить ссылку: [ссылка на Google Form].</w:t>
+        <w:t>Опубликовать форму и вставить ссылку: https://docs.google.com/forms/d/e/1FAIpQLScvyQ4Vzx3cxv3eQUqYjEYiqod6y7ALnRlsZYiTavVku9sEsA/viewform.</w:t>
       </w:r>
     </w:p>
     <w:p>
@@ -3410,6 +3410,11 @@
       </w:tr>
     </w:tbl>
     <w:p/>
+    <w:p>
+      <w:r>
+        <w:t>Адрес размещения теста: https://docs.google.com/forms/d/e/1FAIpQLScvyQ4Vzx3cxv3eQUqYjEYiqod6y7ALnRlsZYiTavVku9sEsA/viewform</w:t>
+      </w:r>
+    </w:p>
     <w:sectPr>
       <w:pgSz w:w="12240" w:h="15840"/>
       <w:pgMar w:top="1020" w:right="850" w:bottom="1020" w:left="1134" w:header="720" w:footer="720" w:gutter="0"/>

</xml_diff>

<commit_message>
Add real Google Forms responses
</commit_message>
<xml_diff>
--- a/Психологический_центр_готово/08_Практика_7_Анкетирование/Практика7_Анкетирование_отчет.docx
+++ b/Психологический_центр_готово/08_Практика_7_Анкетирование/Практика7_Анкетирование_отчет.docx
@@ -145,7 +145,7 @@
         <w:pStyle w:val="ListNumber"/>
       </w:pPr>
       <w:r>
-        <w:t>Получить минимум 3 ответа и экспортировать таблицу результатов.</w:t>
+        <w:t>Получены 3 реальных ответа, таблица результатов экспортирована в XLSX и добавлена в папку практики.</w:t>
       </w:r>
     </w:p>
     <w:p>
@@ -180,13 +180,7 @@
             <w:shd w:fill="DDEDEA"/>
           </w:tcPr>
           <w:p>
-            <w:r/>
             <w:r>
-              <w:rPr>
-                <w:rFonts w:ascii="Times New Roman" w:hAnsi="Times New Roman"/>
-                <w:b/>
-                <w:sz w:val="20"/>
-              </w:rPr>
               <w:t>N</w:t>
             </w:r>
           </w:p>
@@ -198,13 +192,7 @@
             <w:shd w:fill="DDEDEA"/>
           </w:tcPr>
           <w:p>
-            <w:r/>
             <w:r>
-              <w:rPr>
-                <w:rFonts w:ascii="Times New Roman" w:hAnsi="Times New Roman"/>
-                <w:b/>
-                <w:sz w:val="20"/>
-              </w:rPr>
               <w:t>Вопрос</w:t>
             </w:r>
           </w:p>
@@ -216,13 +204,7 @@
             <w:shd w:fill="DDEDEA"/>
           </w:tcPr>
           <w:p>
-            <w:r/>
             <w:r>
-              <w:rPr>
-                <w:rFonts w:ascii="Times New Roman" w:hAnsi="Times New Roman"/>
-                <w:b/>
-                <w:sz w:val="20"/>
-              </w:rPr>
               <w:t>Ответы</w:t>
             </w:r>
           </w:p>
@@ -235,13 +217,7 @@
             <w:vAlign w:val="center"/>
           </w:tcPr>
           <w:p>
-            <w:r/>
             <w:r>
-              <w:rPr>
-                <w:rFonts w:ascii="Times New Roman" w:hAnsi="Times New Roman"/>
-                <w:b w:val="0"/>
-                <w:sz w:val="20"/>
-              </w:rPr>
               <w:t>1</w:t>
             </w:r>
           </w:p>
@@ -252,13 +228,7 @@
             <w:vAlign w:val="center"/>
           </w:tcPr>
           <w:p>
-            <w:r/>
             <w:r>
-              <w:rPr>
-                <w:rFonts w:ascii="Times New Roman" w:hAnsi="Times New Roman"/>
-                <w:b w:val="0"/>
-                <w:sz w:val="20"/>
-              </w:rPr>
               <w:t>Я могу долго работать без устали.</w:t>
             </w:r>
           </w:p>
@@ -269,13 +239,7 @@
             <w:vAlign w:val="center"/>
           </w:tcPr>
           <w:p>
-            <w:r/>
             <w:r>
-              <w:rPr>
-                <w:rFonts w:ascii="Times New Roman" w:hAnsi="Times New Roman"/>
-                <w:b w:val="0"/>
-                <w:sz w:val="20"/>
-              </w:rPr>
               <w:t>Да / Нет</w:t>
             </w:r>
           </w:p>
@@ -288,13 +252,7 @@
             <w:vAlign w:val="center"/>
           </w:tcPr>
           <w:p>
-            <w:r/>
             <w:r>
-              <w:rPr>
-                <w:rFonts w:ascii="Times New Roman" w:hAnsi="Times New Roman"/>
-                <w:b w:val="0"/>
-                <w:sz w:val="20"/>
-              </w:rPr>
               <w:t>2</w:t>
             </w:r>
           </w:p>
@@ -305,13 +263,7 @@
             <w:vAlign w:val="center"/>
           </w:tcPr>
           <w:p>
-            <w:r/>
             <w:r>
-              <w:rPr>
-                <w:rFonts w:ascii="Times New Roman" w:hAnsi="Times New Roman"/>
-                <w:b w:val="0"/>
-                <w:sz w:val="20"/>
-              </w:rPr>
               <w:t>Я всегда выполняю то, что обещаю, независимо от испытываемых в связи с этим неудобств.</w:t>
             </w:r>
           </w:p>
@@ -322,13 +274,7 @@
             <w:vAlign w:val="center"/>
           </w:tcPr>
           <w:p>
-            <w:r/>
             <w:r>
-              <w:rPr>
-                <w:rFonts w:ascii="Times New Roman" w:hAnsi="Times New Roman"/>
-                <w:b w:val="0"/>
-                <w:sz w:val="20"/>
-              </w:rPr>
               <w:t>Да / Нет</w:t>
             </w:r>
           </w:p>
@@ -341,13 +287,7 @@
             <w:vAlign w:val="center"/>
           </w:tcPr>
           <w:p>
-            <w:r/>
             <w:r>
-              <w:rPr>
-                <w:rFonts w:ascii="Times New Roman" w:hAnsi="Times New Roman"/>
-                <w:b w:val="0"/>
-                <w:sz w:val="20"/>
-              </w:rPr>
               <w:t>3</w:t>
             </w:r>
           </w:p>
@@ -358,13 +298,7 @@
             <w:vAlign w:val="center"/>
           </w:tcPr>
           <w:p>
-            <w:r/>
             <w:r>
-              <w:rPr>
-                <w:rFonts w:ascii="Times New Roman" w:hAnsi="Times New Roman"/>
-                <w:b w:val="0"/>
-                <w:sz w:val="20"/>
-              </w:rPr>
               <w:t>Как правило, руки и ноги у меня теплые.</w:t>
             </w:r>
           </w:p>
@@ -375,13 +309,7 @@
             <w:vAlign w:val="center"/>
           </w:tcPr>
           <w:p>
-            <w:r/>
             <w:r>
-              <w:rPr>
-                <w:rFonts w:ascii="Times New Roman" w:hAnsi="Times New Roman"/>
-                <w:b w:val="0"/>
-                <w:sz w:val="20"/>
-              </w:rPr>
               <w:t>Да / Нет</w:t>
             </w:r>
           </w:p>
@@ -394,13 +322,7 @@
             <w:vAlign w:val="center"/>
           </w:tcPr>
           <w:p>
-            <w:r/>
             <w:r>
-              <w:rPr>
-                <w:rFonts w:ascii="Times New Roman" w:hAnsi="Times New Roman"/>
-                <w:b w:val="0"/>
-                <w:sz w:val="20"/>
-              </w:rPr>
               <w:t>4</w:t>
             </w:r>
           </w:p>
@@ -411,13 +333,7 @@
             <w:vAlign w:val="center"/>
           </w:tcPr>
           <w:p>
-            <w:r/>
             <w:r>
-              <w:rPr>
-                <w:rFonts w:ascii="Times New Roman" w:hAnsi="Times New Roman"/>
-                <w:b w:val="0"/>
-                <w:sz w:val="20"/>
-              </w:rPr>
               <w:t>Я редко страдаю от головных болей.</w:t>
             </w:r>
           </w:p>
@@ -428,13 +344,7 @@
             <w:vAlign w:val="center"/>
           </w:tcPr>
           <w:p>
-            <w:r/>
             <w:r>
-              <w:rPr>
-                <w:rFonts w:ascii="Times New Roman" w:hAnsi="Times New Roman"/>
-                <w:b w:val="0"/>
-                <w:sz w:val="20"/>
-              </w:rPr>
               <w:t>Да / Нет</w:t>
             </w:r>
           </w:p>
@@ -447,13 +357,7 @@
             <w:vAlign w:val="center"/>
           </w:tcPr>
           <w:p>
-            <w:r/>
             <w:r>
-              <w:rPr>
-                <w:rFonts w:ascii="Times New Roman" w:hAnsi="Times New Roman"/>
-                <w:b w:val="0"/>
-                <w:sz w:val="20"/>
-              </w:rPr>
               <w:t>5</w:t>
             </w:r>
           </w:p>
@@ -464,13 +368,7 @@
             <w:vAlign w:val="center"/>
           </w:tcPr>
           <w:p>
-            <w:r/>
             <w:r>
-              <w:rPr>
-                <w:rFonts w:ascii="Times New Roman" w:hAnsi="Times New Roman"/>
-                <w:b w:val="0"/>
-                <w:sz w:val="20"/>
-              </w:rPr>
               <w:t>Я уверен в своих силах.</w:t>
             </w:r>
           </w:p>
@@ -481,13 +379,7 @@
             <w:vAlign w:val="center"/>
           </w:tcPr>
           <w:p>
-            <w:r/>
             <w:r>
-              <w:rPr>
-                <w:rFonts w:ascii="Times New Roman" w:hAnsi="Times New Roman"/>
-                <w:b w:val="0"/>
-                <w:sz w:val="20"/>
-              </w:rPr>
               <w:t>Да / Нет</w:t>
             </w:r>
           </w:p>
@@ -500,13 +392,7 @@
             <w:vAlign w:val="center"/>
           </w:tcPr>
           <w:p>
-            <w:r/>
             <w:r>
-              <w:rPr>
-                <w:rFonts w:ascii="Times New Roman" w:hAnsi="Times New Roman"/>
-                <w:b w:val="0"/>
-                <w:sz w:val="20"/>
-              </w:rPr>
               <w:t>6</w:t>
             </w:r>
           </w:p>
@@ -517,13 +403,7 @@
             <w:vAlign w:val="center"/>
           </w:tcPr>
           <w:p>
-            <w:r/>
             <w:r>
-              <w:rPr>
-                <w:rFonts w:ascii="Times New Roman" w:hAnsi="Times New Roman"/>
-                <w:b w:val="0"/>
-                <w:sz w:val="20"/>
-              </w:rPr>
               <w:t>Ожидание раздражает меня.</w:t>
             </w:r>
           </w:p>
@@ -534,13 +414,7 @@
             <w:vAlign w:val="center"/>
           </w:tcPr>
           <w:p>
-            <w:r/>
             <w:r>
-              <w:rPr>
-                <w:rFonts w:ascii="Times New Roman" w:hAnsi="Times New Roman"/>
-                <w:b w:val="0"/>
-                <w:sz w:val="20"/>
-              </w:rPr>
               <w:t>Да / Нет</w:t>
             </w:r>
           </w:p>
@@ -553,13 +427,7 @@
             <w:vAlign w:val="center"/>
           </w:tcPr>
           <w:p>
-            <w:r/>
             <w:r>
-              <w:rPr>
-                <w:rFonts w:ascii="Times New Roman" w:hAnsi="Times New Roman"/>
-                <w:b w:val="0"/>
-                <w:sz w:val="20"/>
-              </w:rPr>
               <w:t>7</w:t>
             </w:r>
           </w:p>
@@ -570,13 +438,7 @@
             <w:vAlign w:val="center"/>
           </w:tcPr>
           <w:p>
-            <w:r/>
             <w:r>
-              <w:rPr>
-                <w:rFonts w:ascii="Times New Roman" w:hAnsi="Times New Roman"/>
-                <w:b w:val="0"/>
-                <w:sz w:val="20"/>
-              </w:rPr>
               <w:t>Иногда я сам себе кажусь ни на что не годным.</w:t>
             </w:r>
           </w:p>
@@ -587,13 +449,7 @@
             <w:vAlign w:val="center"/>
           </w:tcPr>
           <w:p>
-            <w:r/>
             <w:r>
-              <w:rPr>
-                <w:rFonts w:ascii="Times New Roman" w:hAnsi="Times New Roman"/>
-                <w:b w:val="0"/>
-                <w:sz w:val="20"/>
-              </w:rPr>
               <w:t>Да / Нет</w:t>
             </w:r>
           </w:p>
@@ -606,13 +462,7 @@
             <w:vAlign w:val="center"/>
           </w:tcPr>
           <w:p>
-            <w:r/>
             <w:r>
-              <w:rPr>
-                <w:rFonts w:ascii="Times New Roman" w:hAnsi="Times New Roman"/>
-                <w:b w:val="0"/>
-                <w:sz w:val="20"/>
-              </w:rPr>
               <w:t>8</w:t>
             </w:r>
           </w:p>
@@ -623,13 +473,7 @@
             <w:vAlign w:val="center"/>
           </w:tcPr>
           <w:p>
-            <w:r/>
             <w:r>
-              <w:rPr>
-                <w:rFonts w:ascii="Times New Roman" w:hAnsi="Times New Roman"/>
-                <w:b w:val="0"/>
-                <w:sz w:val="20"/>
-              </w:rPr>
               <w:t>В большинстве случаев я чувствую себя вполне счастливым.</w:t>
             </w:r>
           </w:p>
@@ -640,13 +484,7 @@
             <w:vAlign w:val="center"/>
           </w:tcPr>
           <w:p>
-            <w:r/>
             <w:r>
-              <w:rPr>
-                <w:rFonts w:ascii="Times New Roman" w:hAnsi="Times New Roman"/>
-                <w:b w:val="0"/>
-                <w:sz w:val="20"/>
-              </w:rPr>
               <w:t>Да / Нет</w:t>
             </w:r>
           </w:p>
@@ -659,13 +497,7 @@
             <w:vAlign w:val="center"/>
           </w:tcPr>
           <w:p>
-            <w:r/>
             <w:r>
-              <w:rPr>
-                <w:rFonts w:ascii="Times New Roman" w:hAnsi="Times New Roman"/>
-                <w:b w:val="0"/>
-                <w:sz w:val="20"/>
-              </w:rPr>
               <w:t>9</w:t>
             </w:r>
           </w:p>
@@ -676,13 +508,7 @@
             <w:vAlign w:val="center"/>
           </w:tcPr>
           <w:p>
-            <w:r/>
             <w:r>
-              <w:rPr>
-                <w:rFonts w:ascii="Times New Roman" w:hAnsi="Times New Roman"/>
-                <w:b w:val="0"/>
-                <w:sz w:val="20"/>
-              </w:rPr>
               <w:t>Мне трудно сосредоточиться на каком-то одном предмете.</w:t>
             </w:r>
           </w:p>
@@ -693,13 +519,7 @@
             <w:vAlign w:val="center"/>
           </w:tcPr>
           <w:p>
-            <w:r/>
             <w:r>
-              <w:rPr>
-                <w:rFonts w:ascii="Times New Roman" w:hAnsi="Times New Roman"/>
-                <w:b w:val="0"/>
-                <w:sz w:val="20"/>
-              </w:rPr>
               <w:t>Да / Нет</w:t>
             </w:r>
           </w:p>
@@ -712,13 +532,7 @@
             <w:vAlign w:val="center"/>
           </w:tcPr>
           <w:p>
-            <w:r/>
             <w:r>
-              <w:rPr>
-                <w:rFonts w:ascii="Times New Roman" w:hAnsi="Times New Roman"/>
-                <w:b w:val="0"/>
-                <w:sz w:val="20"/>
-              </w:rPr>
               <w:t>10</w:t>
             </w:r>
           </w:p>
@@ -729,13 +543,7 @@
             <w:vAlign w:val="center"/>
           </w:tcPr>
           <w:p>
-            <w:r/>
             <w:r>
-              <w:rPr>
-                <w:rFonts w:ascii="Times New Roman" w:hAnsi="Times New Roman"/>
-                <w:b w:val="0"/>
-                <w:sz w:val="20"/>
-              </w:rPr>
               <w:t>В детстве я с готовностью выполнял все данные мне поручения.</w:t>
             </w:r>
           </w:p>
@@ -746,13 +554,7 @@
             <w:vAlign w:val="center"/>
           </w:tcPr>
           <w:p>
-            <w:r/>
             <w:r>
-              <w:rPr>
-                <w:rFonts w:ascii="Times New Roman" w:hAnsi="Times New Roman"/>
-                <w:b w:val="0"/>
-                <w:sz w:val="20"/>
-              </w:rPr>
               <w:t>Да / Нет</w:t>
             </w:r>
           </w:p>
@@ -765,13 +567,7 @@
             <w:vAlign w:val="center"/>
           </w:tcPr>
           <w:p>
-            <w:r/>
             <w:r>
-              <w:rPr>
-                <w:rFonts w:ascii="Times New Roman" w:hAnsi="Times New Roman"/>
-                <w:b w:val="0"/>
-                <w:sz w:val="20"/>
-              </w:rPr>
               <w:t>11</w:t>
             </w:r>
           </w:p>
@@ -782,13 +578,7 @@
             <w:vAlign w:val="center"/>
           </w:tcPr>
           <w:p>
-            <w:r/>
             <w:r>
-              <w:rPr>
-                <w:rFonts w:ascii="Times New Roman" w:hAnsi="Times New Roman"/>
-                <w:b w:val="0"/>
-                <w:sz w:val="20"/>
-              </w:rPr>
               <w:t>Не реже одного раза в месяц я страдаю от расстройства желудка.</w:t>
             </w:r>
           </w:p>
@@ -799,13 +589,7 @@
             <w:vAlign w:val="center"/>
           </w:tcPr>
           <w:p>
-            <w:r/>
             <w:r>
-              <w:rPr>
-                <w:rFonts w:ascii="Times New Roman" w:hAnsi="Times New Roman"/>
-                <w:b w:val="0"/>
-                <w:sz w:val="20"/>
-              </w:rPr>
               <w:t>Да / Нет</w:t>
             </w:r>
           </w:p>
@@ -818,13 +602,7 @@
             <w:vAlign w:val="center"/>
           </w:tcPr>
           <w:p>
-            <w:r/>
             <w:r>
-              <w:rPr>
-                <w:rFonts w:ascii="Times New Roman" w:hAnsi="Times New Roman"/>
-                <w:b w:val="0"/>
-                <w:sz w:val="20"/>
-              </w:rPr>
               <w:t>12</w:t>
             </w:r>
           </w:p>
@@ -835,13 +613,7 @@
             <w:vAlign w:val="center"/>
           </w:tcPr>
           <w:p>
-            <w:r/>
             <w:r>
-              <w:rPr>
-                <w:rFonts w:ascii="Times New Roman" w:hAnsi="Times New Roman"/>
-                <w:b w:val="0"/>
-                <w:sz w:val="20"/>
-              </w:rPr>
               <w:t>Я часто испытываю тревогу по какому-нибудь поводу.</w:t>
             </w:r>
           </w:p>
@@ -852,13 +624,7 @@
             <w:vAlign w:val="center"/>
           </w:tcPr>
           <w:p>
-            <w:r/>
             <w:r>
-              <w:rPr>
-                <w:rFonts w:ascii="Times New Roman" w:hAnsi="Times New Roman"/>
-                <w:b w:val="0"/>
-                <w:sz w:val="20"/>
-              </w:rPr>
               <w:t>Да / Нет</w:t>
             </w:r>
           </w:p>
@@ -871,13 +637,7 @@
             <w:vAlign w:val="center"/>
           </w:tcPr>
           <w:p>
-            <w:r/>
             <w:r>
-              <w:rPr>
-                <w:rFonts w:ascii="Times New Roman" w:hAnsi="Times New Roman"/>
-                <w:b w:val="0"/>
-                <w:sz w:val="20"/>
-              </w:rPr>
               <w:t>13</w:t>
             </w:r>
           </w:p>
@@ -888,13 +648,7 @@
             <w:vAlign w:val="center"/>
           </w:tcPr>
           <w:p>
-            <w:r/>
             <w:r>
-              <w:rPr>
-                <w:rFonts w:ascii="Times New Roman" w:hAnsi="Times New Roman"/>
-                <w:b w:val="0"/>
-                <w:sz w:val="20"/>
-              </w:rPr>
               <w:t>Я не считаю себя более нервным, чем большинство людей.</w:t>
             </w:r>
           </w:p>
@@ -905,13 +659,7 @@
             <w:vAlign w:val="center"/>
           </w:tcPr>
           <w:p>
-            <w:r/>
             <w:r>
-              <w:rPr>
-                <w:rFonts w:ascii="Times New Roman" w:hAnsi="Times New Roman"/>
-                <w:b w:val="0"/>
-                <w:sz w:val="20"/>
-              </w:rPr>
               <w:t>Да / Нет</w:t>
             </w:r>
           </w:p>
@@ -924,13 +672,7 @@
             <w:vAlign w:val="center"/>
           </w:tcPr>
           <w:p>
-            <w:r/>
             <w:r>
-              <w:rPr>
-                <w:rFonts w:ascii="Times New Roman" w:hAnsi="Times New Roman"/>
-                <w:b w:val="0"/>
-                <w:sz w:val="20"/>
-              </w:rPr>
               <w:t>14</w:t>
             </w:r>
           </w:p>
@@ -941,13 +683,7 @@
             <w:vAlign w:val="center"/>
           </w:tcPr>
           <w:p>
-            <w:r/>
             <w:r>
-              <w:rPr>
-                <w:rFonts w:ascii="Times New Roman" w:hAnsi="Times New Roman"/>
-                <w:b w:val="0"/>
-                <w:sz w:val="20"/>
-              </w:rPr>
               <w:t>Я не застенчив.</w:t>
             </w:r>
           </w:p>
@@ -958,13 +694,7 @@
             <w:vAlign w:val="center"/>
           </w:tcPr>
           <w:p>
-            <w:r/>
             <w:r>
-              <w:rPr>
-                <w:rFonts w:ascii="Times New Roman" w:hAnsi="Times New Roman"/>
-                <w:b w:val="0"/>
-                <w:sz w:val="20"/>
-              </w:rPr>
               <w:t>Да / Нет</w:t>
             </w:r>
           </w:p>
@@ -977,13 +707,7 @@
             <w:vAlign w:val="center"/>
           </w:tcPr>
           <w:p>
-            <w:r/>
             <w:r>
-              <w:rPr>
-                <w:rFonts w:ascii="Times New Roman" w:hAnsi="Times New Roman"/>
-                <w:b w:val="0"/>
-                <w:sz w:val="20"/>
-              </w:rPr>
               <w:t>15</w:t>
             </w:r>
           </w:p>
@@ -994,13 +718,7 @@
             <w:vAlign w:val="center"/>
           </w:tcPr>
           <w:p>
-            <w:r/>
             <w:r>
-              <w:rPr>
-                <w:rFonts w:ascii="Times New Roman" w:hAnsi="Times New Roman"/>
-                <w:b w:val="0"/>
-                <w:sz w:val="20"/>
-              </w:rPr>
               <w:t>Жизнь для меня почти всегда связана с большим напряжением.</w:t>
             </w:r>
           </w:p>
@@ -1011,13 +729,7 @@
             <w:vAlign w:val="center"/>
           </w:tcPr>
           <w:p>
-            <w:r/>
             <w:r>
-              <w:rPr>
-                <w:rFonts w:ascii="Times New Roman" w:hAnsi="Times New Roman"/>
-                <w:b w:val="0"/>
-                <w:sz w:val="20"/>
-              </w:rPr>
               <w:t>Да / Нет</w:t>
             </w:r>
           </w:p>
@@ -1030,13 +742,7 @@
             <w:vAlign w:val="center"/>
           </w:tcPr>
           <w:p>
-            <w:r/>
             <w:r>
-              <w:rPr>
-                <w:rFonts w:ascii="Times New Roman" w:hAnsi="Times New Roman"/>
-                <w:b w:val="0"/>
-                <w:sz w:val="20"/>
-              </w:rPr>
               <w:t>16</w:t>
             </w:r>
           </w:p>
@@ -1047,13 +753,7 @@
             <w:vAlign w:val="center"/>
           </w:tcPr>
           <w:p>
-            <w:r/>
             <w:r>
-              <w:rPr>
-                <w:rFonts w:ascii="Times New Roman" w:hAnsi="Times New Roman"/>
-                <w:b w:val="0"/>
-                <w:sz w:val="20"/>
-              </w:rPr>
               <w:t>Иногда бывает, что я говорю о вещах, в которых не разбираюсь.</w:t>
             </w:r>
           </w:p>
@@ -1064,13 +764,7 @@
             <w:vAlign w:val="center"/>
           </w:tcPr>
           <w:p>
-            <w:r/>
             <w:r>
-              <w:rPr>
-                <w:rFonts w:ascii="Times New Roman" w:hAnsi="Times New Roman"/>
-                <w:b w:val="0"/>
-                <w:sz w:val="20"/>
-              </w:rPr>
               <w:t>Да / Нет</w:t>
             </w:r>
           </w:p>
@@ -1083,13 +777,7 @@
             <w:vAlign w:val="center"/>
           </w:tcPr>
           <w:p>
-            <w:r/>
             <w:r>
-              <w:rPr>
-                <w:rFonts w:ascii="Times New Roman" w:hAnsi="Times New Roman"/>
-                <w:b w:val="0"/>
-                <w:sz w:val="20"/>
-              </w:rPr>
               <w:t>17</w:t>
             </w:r>
           </w:p>
@@ -1100,13 +788,7 @@
             <w:vAlign w:val="center"/>
           </w:tcPr>
           <w:p>
-            <w:r/>
             <w:r>
-              <w:rPr>
-                <w:rFonts w:ascii="Times New Roman" w:hAnsi="Times New Roman"/>
-                <w:b w:val="0"/>
-                <w:sz w:val="20"/>
-              </w:rPr>
               <w:t>Я краснею не чаще, чем другие.</w:t>
             </w:r>
           </w:p>
@@ -1117,13 +799,7 @@
             <w:vAlign w:val="center"/>
           </w:tcPr>
           <w:p>
-            <w:r/>
             <w:r>
-              <w:rPr>
-                <w:rFonts w:ascii="Times New Roman" w:hAnsi="Times New Roman"/>
-                <w:b w:val="0"/>
-                <w:sz w:val="20"/>
-              </w:rPr>
               <w:t>Да / Нет</w:t>
             </w:r>
           </w:p>
@@ -1136,13 +812,7 @@
             <w:vAlign w:val="center"/>
           </w:tcPr>
           <w:p>
-            <w:r/>
             <w:r>
-              <w:rPr>
-                <w:rFonts w:ascii="Times New Roman" w:hAnsi="Times New Roman"/>
-                <w:b w:val="0"/>
-                <w:sz w:val="20"/>
-              </w:rPr>
               <w:t>18</w:t>
             </w:r>
           </w:p>
@@ -1153,13 +823,7 @@
             <w:vAlign w:val="center"/>
           </w:tcPr>
           <w:p>
-            <w:r/>
             <w:r>
-              <w:rPr>
-                <w:rFonts w:ascii="Times New Roman" w:hAnsi="Times New Roman"/>
-                <w:b w:val="0"/>
-                <w:sz w:val="20"/>
-              </w:rPr>
               <w:t>Я часто расстраиваюсь из-за пустяков.</w:t>
             </w:r>
           </w:p>
@@ -1170,13 +834,7 @@
             <w:vAlign w:val="center"/>
           </w:tcPr>
           <w:p>
-            <w:r/>
             <w:r>
-              <w:rPr>
-                <w:rFonts w:ascii="Times New Roman" w:hAnsi="Times New Roman"/>
-                <w:b w:val="0"/>
-                <w:sz w:val="20"/>
-              </w:rPr>
               <w:t>Да / Нет</w:t>
             </w:r>
           </w:p>
@@ -1189,13 +847,7 @@
             <w:vAlign w:val="center"/>
           </w:tcPr>
           <w:p>
-            <w:r/>
             <w:r>
-              <w:rPr>
-                <w:rFonts w:ascii="Times New Roman" w:hAnsi="Times New Roman"/>
-                <w:b w:val="0"/>
-                <w:sz w:val="20"/>
-              </w:rPr>
               <w:t>19</w:t>
             </w:r>
           </w:p>
@@ -1206,13 +858,7 @@
             <w:vAlign w:val="center"/>
           </w:tcPr>
           <w:p>
-            <w:r/>
             <w:r>
-              <w:rPr>
-                <w:rFonts w:ascii="Times New Roman" w:hAnsi="Times New Roman"/>
-                <w:b w:val="0"/>
-                <w:sz w:val="20"/>
-              </w:rPr>
               <w:t>Я редко замечаю у себя сердцебиение и одышку.</w:t>
             </w:r>
           </w:p>
@@ -1223,13 +869,7 @@
             <w:vAlign w:val="center"/>
           </w:tcPr>
           <w:p>
-            <w:r/>
             <w:r>
-              <w:rPr>
-                <w:rFonts w:ascii="Times New Roman" w:hAnsi="Times New Roman"/>
-                <w:b w:val="0"/>
-                <w:sz w:val="20"/>
-              </w:rPr>
               <w:t>Да / Нет</w:t>
             </w:r>
           </w:p>
@@ -1242,13 +882,7 @@
             <w:vAlign w:val="center"/>
           </w:tcPr>
           <w:p>
-            <w:r/>
             <w:r>
-              <w:rPr>
-                <w:rFonts w:ascii="Times New Roman" w:hAnsi="Times New Roman"/>
-                <w:b w:val="0"/>
-                <w:sz w:val="20"/>
-              </w:rPr>
               <w:t>20</w:t>
             </w:r>
           </w:p>
@@ -1259,13 +893,7 @@
             <w:vAlign w:val="center"/>
           </w:tcPr>
           <w:p>
-            <w:r/>
             <w:r>
-              <w:rPr>
-                <w:rFonts w:ascii="Times New Roman" w:hAnsi="Times New Roman"/>
-                <w:b w:val="0"/>
-                <w:sz w:val="20"/>
-              </w:rPr>
               <w:t>Не все люди, которых я знаю, мне нравятся.</w:t>
             </w:r>
           </w:p>
@@ -1276,13 +904,7 @@
             <w:vAlign w:val="center"/>
           </w:tcPr>
           <w:p>
-            <w:r/>
             <w:r>
-              <w:rPr>
-                <w:rFonts w:ascii="Times New Roman" w:hAnsi="Times New Roman"/>
-                <w:b w:val="0"/>
-                <w:sz w:val="20"/>
-              </w:rPr>
               <w:t>Да / Нет</w:t>
             </w:r>
           </w:p>
@@ -1295,13 +917,7 @@
             <w:vAlign w:val="center"/>
           </w:tcPr>
           <w:p>
-            <w:r/>
             <w:r>
-              <w:rPr>
-                <w:rFonts w:ascii="Times New Roman" w:hAnsi="Times New Roman"/>
-                <w:b w:val="0"/>
-                <w:sz w:val="20"/>
-              </w:rPr>
               <w:t>21</w:t>
             </w:r>
           </w:p>
@@ -1312,13 +928,7 @@
             <w:vAlign w:val="center"/>
           </w:tcPr>
           <w:p>
-            <w:r/>
             <w:r>
-              <w:rPr>
-                <w:rFonts w:ascii="Times New Roman" w:hAnsi="Times New Roman"/>
-                <w:b w:val="0"/>
-                <w:sz w:val="20"/>
-              </w:rPr>
               <w:t>Я не могу уснуть, если меня что-то тревожит.</w:t>
             </w:r>
           </w:p>
@@ -1329,13 +939,7 @@
             <w:vAlign w:val="center"/>
           </w:tcPr>
           <w:p>
-            <w:r/>
             <w:r>
-              <w:rPr>
-                <w:rFonts w:ascii="Times New Roman" w:hAnsi="Times New Roman"/>
-                <w:b w:val="0"/>
-                <w:sz w:val="20"/>
-              </w:rPr>
               <w:t>Да / Нет</w:t>
             </w:r>
           </w:p>
@@ -1348,13 +952,7 @@
             <w:vAlign w:val="center"/>
           </w:tcPr>
           <w:p>
-            <w:r/>
             <w:r>
-              <w:rPr>
-                <w:rFonts w:ascii="Times New Roman" w:hAnsi="Times New Roman"/>
-                <w:b w:val="0"/>
-                <w:sz w:val="20"/>
-              </w:rPr>
               <w:t>22</w:t>
             </w:r>
           </w:p>
@@ -1365,13 +963,7 @@
             <w:vAlign w:val="center"/>
           </w:tcPr>
           <w:p>
-            <w:r/>
             <w:r>
-              <w:rPr>
-                <w:rFonts w:ascii="Times New Roman" w:hAnsi="Times New Roman"/>
-                <w:b w:val="0"/>
-                <w:sz w:val="20"/>
-              </w:rPr>
               <w:t>Обычно я спокоен, и меня нелегко расстроить.</w:t>
             </w:r>
           </w:p>
@@ -1382,13 +974,7 @@
             <w:vAlign w:val="center"/>
           </w:tcPr>
           <w:p>
-            <w:r/>
             <w:r>
-              <w:rPr>
-                <w:rFonts w:ascii="Times New Roman" w:hAnsi="Times New Roman"/>
-                <w:b w:val="0"/>
-                <w:sz w:val="20"/>
-              </w:rPr>
               <w:t>Да / Нет</w:t>
             </w:r>
           </w:p>
@@ -1401,13 +987,7 @@
             <w:vAlign w:val="center"/>
           </w:tcPr>
           <w:p>
-            <w:r/>
             <w:r>
-              <w:rPr>
-                <w:rFonts w:ascii="Times New Roman" w:hAnsi="Times New Roman"/>
-                <w:b w:val="0"/>
-                <w:sz w:val="20"/>
-              </w:rPr>
               <w:t>23</w:t>
             </w:r>
           </w:p>
@@ -1418,13 +998,7 @@
             <w:vAlign w:val="center"/>
           </w:tcPr>
           <w:p>
-            <w:r/>
             <w:r>
-              <w:rPr>
-                <w:rFonts w:ascii="Times New Roman" w:hAnsi="Times New Roman"/>
-                <w:b w:val="0"/>
-                <w:sz w:val="20"/>
-              </w:rPr>
               <w:t>Меня часто мучают ночные кошмары.</w:t>
             </w:r>
           </w:p>
@@ -1435,13 +1009,7 @@
             <w:vAlign w:val="center"/>
           </w:tcPr>
           <w:p>
-            <w:r/>
             <w:r>
-              <w:rPr>
-                <w:rFonts w:ascii="Times New Roman" w:hAnsi="Times New Roman"/>
-                <w:b w:val="0"/>
-                <w:sz w:val="20"/>
-              </w:rPr>
               <w:t>Да / Нет</w:t>
             </w:r>
           </w:p>
@@ -1454,13 +1022,7 @@
             <w:vAlign w:val="center"/>
           </w:tcPr>
           <w:p>
-            <w:r/>
             <w:r>
-              <w:rPr>
-                <w:rFonts w:ascii="Times New Roman" w:hAnsi="Times New Roman"/>
-                <w:b w:val="0"/>
-                <w:sz w:val="20"/>
-              </w:rPr>
               <w:t>24</w:t>
             </w:r>
           </w:p>
@@ -1471,13 +1033,7 @@
             <w:vAlign w:val="center"/>
           </w:tcPr>
           <w:p>
-            <w:r/>
             <w:r>
-              <w:rPr>
-                <w:rFonts w:ascii="Times New Roman" w:hAnsi="Times New Roman"/>
-                <w:b w:val="0"/>
-                <w:sz w:val="20"/>
-              </w:rPr>
               <w:t>Я склонен все принимать всерьез.</w:t>
             </w:r>
           </w:p>
@@ -1488,13 +1044,7 @@
             <w:vAlign w:val="center"/>
           </w:tcPr>
           <w:p>
-            <w:r/>
             <w:r>
-              <w:rPr>
-                <w:rFonts w:ascii="Times New Roman" w:hAnsi="Times New Roman"/>
-                <w:b w:val="0"/>
-                <w:sz w:val="20"/>
-              </w:rPr>
               <w:t>Да / Нет</w:t>
             </w:r>
           </w:p>
@@ -1507,13 +1057,7 @@
             <w:vAlign w:val="center"/>
           </w:tcPr>
           <w:p>
-            <w:r/>
             <w:r>
-              <w:rPr>
-                <w:rFonts w:ascii="Times New Roman" w:hAnsi="Times New Roman"/>
-                <w:b w:val="0"/>
-                <w:sz w:val="20"/>
-              </w:rPr>
               <w:t>25</w:t>
             </w:r>
           </w:p>
@@ -1524,13 +1068,7 @@
             <w:vAlign w:val="center"/>
           </w:tcPr>
           <w:p>
-            <w:r/>
             <w:r>
-              <w:rPr>
-                <w:rFonts w:ascii="Times New Roman" w:hAnsi="Times New Roman"/>
-                <w:b w:val="0"/>
-                <w:sz w:val="20"/>
-              </w:rPr>
               <w:t>Когда я нервничаю, у меня усиливается потливость.</w:t>
             </w:r>
           </w:p>
@@ -1541,13 +1079,7 @@
             <w:vAlign w:val="center"/>
           </w:tcPr>
           <w:p>
-            <w:r/>
             <w:r>
-              <w:rPr>
-                <w:rFonts w:ascii="Times New Roman" w:hAnsi="Times New Roman"/>
-                <w:b w:val="0"/>
-                <w:sz w:val="20"/>
-              </w:rPr>
               <w:t>Да / Нет</w:t>
             </w:r>
           </w:p>
@@ -1560,13 +1092,7 @@
             <w:vAlign w:val="center"/>
           </w:tcPr>
           <w:p>
-            <w:r/>
             <w:r>
-              <w:rPr>
-                <w:rFonts w:ascii="Times New Roman" w:hAnsi="Times New Roman"/>
-                <w:b w:val="0"/>
-                <w:sz w:val="20"/>
-              </w:rPr>
               <w:t>26</w:t>
             </w:r>
           </w:p>
@@ -1577,13 +1103,7 @@
             <w:vAlign w:val="center"/>
           </w:tcPr>
           <w:p>
-            <w:r/>
             <w:r>
-              <w:rPr>
-                <w:rFonts w:ascii="Times New Roman" w:hAnsi="Times New Roman"/>
-                <w:b w:val="0"/>
-                <w:sz w:val="20"/>
-              </w:rPr>
               <w:t>У меня беспокойный и прерывистый сон.</w:t>
             </w:r>
           </w:p>
@@ -1594,13 +1114,7 @@
             <w:vAlign w:val="center"/>
           </w:tcPr>
           <w:p>
-            <w:r/>
             <w:r>
-              <w:rPr>
-                <w:rFonts w:ascii="Times New Roman" w:hAnsi="Times New Roman"/>
-                <w:b w:val="0"/>
-                <w:sz w:val="20"/>
-              </w:rPr>
               <w:t>Да / Нет</w:t>
             </w:r>
           </w:p>
@@ -1613,13 +1127,7 @@
             <w:vAlign w:val="center"/>
           </w:tcPr>
           <w:p>
-            <w:r/>
             <w:r>
-              <w:rPr>
-                <w:rFonts w:ascii="Times New Roman" w:hAnsi="Times New Roman"/>
-                <w:b w:val="0"/>
-                <w:sz w:val="20"/>
-              </w:rPr>
               <w:t>27</w:t>
             </w:r>
           </w:p>
@@ -1630,13 +1138,7 @@
             <w:vAlign w:val="center"/>
           </w:tcPr>
           <w:p>
-            <w:r/>
             <w:r>
-              <w:rPr>
-                <w:rFonts w:ascii="Times New Roman" w:hAnsi="Times New Roman"/>
-                <w:b w:val="0"/>
-                <w:sz w:val="20"/>
-              </w:rPr>
               <w:t>В играх я предпочитаю скорее выигрывать, чем проигрывать.</w:t>
             </w:r>
           </w:p>
@@ -1647,13 +1149,7 @@
             <w:vAlign w:val="center"/>
           </w:tcPr>
           <w:p>
-            <w:r/>
             <w:r>
-              <w:rPr>
-                <w:rFonts w:ascii="Times New Roman" w:hAnsi="Times New Roman"/>
-                <w:b w:val="0"/>
-                <w:sz w:val="20"/>
-              </w:rPr>
               <w:t>Да / Нет</w:t>
             </w:r>
           </w:p>
@@ -1666,13 +1162,7 @@
             <w:vAlign w:val="center"/>
           </w:tcPr>
           <w:p>
-            <w:r/>
             <w:r>
-              <w:rPr>
-                <w:rFonts w:ascii="Times New Roman" w:hAnsi="Times New Roman"/>
-                <w:b w:val="0"/>
-                <w:sz w:val="20"/>
-              </w:rPr>
               <w:t>28</w:t>
             </w:r>
           </w:p>
@@ -1683,13 +1173,7 @@
             <w:vAlign w:val="center"/>
           </w:tcPr>
           <w:p>
-            <w:r/>
             <w:r>
-              <w:rPr>
-                <w:rFonts w:ascii="Times New Roman" w:hAnsi="Times New Roman"/>
-                <w:b w:val="0"/>
-                <w:sz w:val="20"/>
-              </w:rPr>
               <w:t>Я более чувствителен, чем большинство других людей.</w:t>
             </w:r>
           </w:p>
@@ -1700,13 +1184,7 @@
             <w:vAlign w:val="center"/>
           </w:tcPr>
           <w:p>
-            <w:r/>
             <w:r>
-              <w:rPr>
-                <w:rFonts w:ascii="Times New Roman" w:hAnsi="Times New Roman"/>
-                <w:b w:val="0"/>
-                <w:sz w:val="20"/>
-              </w:rPr>
               <w:t>Да / Нет</w:t>
             </w:r>
           </w:p>
@@ -1719,13 +1197,7 @@
             <w:vAlign w:val="center"/>
           </w:tcPr>
           <w:p>
-            <w:r/>
             <w:r>
-              <w:rPr>
-                <w:rFonts w:ascii="Times New Roman" w:hAnsi="Times New Roman"/>
-                <w:b w:val="0"/>
-                <w:sz w:val="20"/>
-              </w:rPr>
               <w:t>29</w:t>
             </w:r>
           </w:p>
@@ -1736,13 +1208,7 @@
             <w:vAlign w:val="center"/>
           </w:tcPr>
           <w:p>
-            <w:r/>
             <w:r>
-              <w:rPr>
-                <w:rFonts w:ascii="Times New Roman" w:hAnsi="Times New Roman"/>
-                <w:b w:val="0"/>
-                <w:sz w:val="20"/>
-              </w:rPr>
               <w:t>Бывает, что нескромные шутки и остроты вызывают у меня смех.</w:t>
             </w:r>
           </w:p>
@@ -1753,13 +1219,7 @@
             <w:vAlign w:val="center"/>
           </w:tcPr>
           <w:p>
-            <w:r/>
             <w:r>
-              <w:rPr>
-                <w:rFonts w:ascii="Times New Roman" w:hAnsi="Times New Roman"/>
-                <w:b w:val="0"/>
-                <w:sz w:val="20"/>
-              </w:rPr>
               <w:t>Да / Нет</w:t>
             </w:r>
           </w:p>
@@ -1772,13 +1232,7 @@
             <w:vAlign w:val="center"/>
           </w:tcPr>
           <w:p>
-            <w:r/>
             <w:r>
-              <w:rPr>
-                <w:rFonts w:ascii="Times New Roman" w:hAnsi="Times New Roman"/>
-                <w:b w:val="0"/>
-                <w:sz w:val="20"/>
-              </w:rPr>
               <w:t>30</w:t>
             </w:r>
           </w:p>
@@ -1789,13 +1243,7 @@
             <w:vAlign w:val="center"/>
           </w:tcPr>
           <w:p>
-            <w:r/>
             <w:r>
-              <w:rPr>
-                <w:rFonts w:ascii="Times New Roman" w:hAnsi="Times New Roman"/>
-                <w:b w:val="0"/>
-                <w:sz w:val="20"/>
-              </w:rPr>
               <w:t>Я хотел бы быть так же доволен жизнью, как, вероятно, довольны другие.</w:t>
             </w:r>
           </w:p>
@@ -1806,13 +1254,7 @@
             <w:vAlign w:val="center"/>
           </w:tcPr>
           <w:p>
-            <w:r/>
             <w:r>
-              <w:rPr>
-                <w:rFonts w:ascii="Times New Roman" w:hAnsi="Times New Roman"/>
-                <w:b w:val="0"/>
-                <w:sz w:val="20"/>
-              </w:rPr>
               <w:t>Да / Нет</w:t>
             </w:r>
           </w:p>
@@ -1825,13 +1267,7 @@
             <w:vAlign w:val="center"/>
           </w:tcPr>
           <w:p>
-            <w:r/>
             <w:r>
-              <w:rPr>
-                <w:rFonts w:ascii="Times New Roman" w:hAnsi="Times New Roman"/>
-                <w:b w:val="0"/>
-                <w:sz w:val="20"/>
-              </w:rPr>
               <w:t>31</w:t>
             </w:r>
           </w:p>
@@ -1842,13 +1278,7 @@
             <w:vAlign w:val="center"/>
           </w:tcPr>
           <w:p>
-            <w:r/>
             <w:r>
-              <w:rPr>
-                <w:rFonts w:ascii="Times New Roman" w:hAnsi="Times New Roman"/>
-                <w:b w:val="0"/>
-                <w:sz w:val="20"/>
-              </w:rPr>
               <w:t>Мой желудок сильно беспокоит меня.</w:t>
             </w:r>
           </w:p>
@@ -1859,13 +1289,7 @@
             <w:vAlign w:val="center"/>
           </w:tcPr>
           <w:p>
-            <w:r/>
             <w:r>
-              <w:rPr>
-                <w:rFonts w:ascii="Times New Roman" w:hAnsi="Times New Roman"/>
-                <w:b w:val="0"/>
-                <w:sz w:val="20"/>
-              </w:rPr>
               <w:t>Да / Нет</w:t>
             </w:r>
           </w:p>
@@ -1878,13 +1302,7 @@
             <w:vAlign w:val="center"/>
           </w:tcPr>
           <w:p>
-            <w:r/>
             <w:r>
-              <w:rPr>
-                <w:rFonts w:ascii="Times New Roman" w:hAnsi="Times New Roman"/>
-                <w:b w:val="0"/>
-                <w:sz w:val="20"/>
-              </w:rPr>
               <w:t>32</w:t>
             </w:r>
           </w:p>
@@ -1895,13 +1313,7 @@
             <w:vAlign w:val="center"/>
           </w:tcPr>
           <w:p>
-            <w:r/>
             <w:r>
-              <w:rPr>
-                <w:rFonts w:ascii="Times New Roman" w:hAnsi="Times New Roman"/>
-                <w:b w:val="0"/>
-                <w:sz w:val="20"/>
-              </w:rPr>
               <w:t>Я постоянно озабочен своими материальными и служебными делами.</w:t>
             </w:r>
           </w:p>
@@ -1912,13 +1324,7 @@
             <w:vAlign w:val="center"/>
           </w:tcPr>
           <w:p>
-            <w:r/>
             <w:r>
-              <w:rPr>
-                <w:rFonts w:ascii="Times New Roman" w:hAnsi="Times New Roman"/>
-                <w:b w:val="0"/>
-                <w:sz w:val="20"/>
-              </w:rPr>
               <w:t>Да / Нет</w:t>
             </w:r>
           </w:p>
@@ -1931,13 +1337,7 @@
             <w:vAlign w:val="center"/>
           </w:tcPr>
           <w:p>
-            <w:r/>
             <w:r>
-              <w:rPr>
-                <w:rFonts w:ascii="Times New Roman" w:hAnsi="Times New Roman"/>
-                <w:b w:val="0"/>
-                <w:sz w:val="20"/>
-              </w:rPr>
               <w:t>33</w:t>
             </w:r>
           </w:p>
@@ -1948,13 +1348,7 @@
             <w:vAlign w:val="center"/>
           </w:tcPr>
           <w:p>
-            <w:r/>
             <w:r>
-              <w:rPr>
-                <w:rFonts w:ascii="Times New Roman" w:hAnsi="Times New Roman"/>
-                <w:b w:val="0"/>
-                <w:sz w:val="20"/>
-              </w:rPr>
               <w:t>Я настороженно отношусь к некоторым людям, хотя знаю, что они не могут причинить мне вреда.</w:t>
             </w:r>
           </w:p>
@@ -1965,13 +1359,7 @@
             <w:vAlign w:val="center"/>
           </w:tcPr>
           <w:p>
-            <w:r/>
             <w:r>
-              <w:rPr>
-                <w:rFonts w:ascii="Times New Roman" w:hAnsi="Times New Roman"/>
-                <w:b w:val="0"/>
-                <w:sz w:val="20"/>
-              </w:rPr>
               <w:t>Да / Нет</w:t>
             </w:r>
           </w:p>
@@ -1984,13 +1372,7 @@
             <w:vAlign w:val="center"/>
           </w:tcPr>
           <w:p>
-            <w:r/>
             <w:r>
-              <w:rPr>
-                <w:rFonts w:ascii="Times New Roman" w:hAnsi="Times New Roman"/>
-                <w:b w:val="0"/>
-                <w:sz w:val="20"/>
-              </w:rPr>
               <w:t>34</w:t>
             </w:r>
           </w:p>
@@ -2001,13 +1383,7 @@
             <w:vAlign w:val="center"/>
           </w:tcPr>
           <w:p>
-            <w:r/>
             <w:r>
-              <w:rPr>
-                <w:rFonts w:ascii="Times New Roman" w:hAnsi="Times New Roman"/>
-                <w:b w:val="0"/>
-                <w:sz w:val="20"/>
-              </w:rPr>
               <w:t>Мне порой кажется, что передо мной нагромождены такие трудности, которых мне не преодолеть.</w:t>
             </w:r>
           </w:p>
@@ -2018,13 +1394,7 @@
             <w:vAlign w:val="center"/>
           </w:tcPr>
           <w:p>
-            <w:r/>
             <w:r>
-              <w:rPr>
-                <w:rFonts w:ascii="Times New Roman" w:hAnsi="Times New Roman"/>
-                <w:b w:val="0"/>
-                <w:sz w:val="20"/>
-              </w:rPr>
               <w:t>Да / Нет</w:t>
             </w:r>
           </w:p>
@@ -2037,13 +1407,7 @@
             <w:vAlign w:val="center"/>
           </w:tcPr>
           <w:p>
-            <w:r/>
             <w:r>
-              <w:rPr>
-                <w:rFonts w:ascii="Times New Roman" w:hAnsi="Times New Roman"/>
-                <w:b w:val="0"/>
-                <w:sz w:val="20"/>
-              </w:rPr>
               <w:t>35</w:t>
             </w:r>
           </w:p>
@@ -2054,13 +1418,7 @@
             <w:vAlign w:val="center"/>
           </w:tcPr>
           <w:p>
-            <w:r/>
             <w:r>
-              <w:rPr>
-                <w:rFonts w:ascii="Times New Roman" w:hAnsi="Times New Roman"/>
-                <w:b w:val="0"/>
-                <w:sz w:val="20"/>
-              </w:rPr>
               <w:t>Я легко прихожу в замешательство.</w:t>
             </w:r>
           </w:p>
@@ -2071,13 +1429,7 @@
             <w:vAlign w:val="center"/>
           </w:tcPr>
           <w:p>
-            <w:r/>
             <w:r>
-              <w:rPr>
-                <w:rFonts w:ascii="Times New Roman" w:hAnsi="Times New Roman"/>
-                <w:b w:val="0"/>
-                <w:sz w:val="20"/>
-              </w:rPr>
               <w:t>Да / Нет</w:t>
             </w:r>
           </w:p>
@@ -2090,13 +1442,7 @@
             <w:vAlign w:val="center"/>
           </w:tcPr>
           <w:p>
-            <w:r/>
             <w:r>
-              <w:rPr>
-                <w:rFonts w:ascii="Times New Roman" w:hAnsi="Times New Roman"/>
-                <w:b w:val="0"/>
-                <w:sz w:val="20"/>
-              </w:rPr>
               <w:t>36</w:t>
             </w:r>
           </w:p>
@@ -2107,13 +1453,7 @@
             <w:vAlign w:val="center"/>
           </w:tcPr>
           <w:p>
-            <w:r/>
             <w:r>
-              <w:rPr>
-                <w:rFonts w:ascii="Times New Roman" w:hAnsi="Times New Roman"/>
-                <w:b w:val="0"/>
-                <w:sz w:val="20"/>
-              </w:rPr>
               <w:t>Временами я становлюсь настолько возбужденным, что это мешает мне заснуть.</w:t>
             </w:r>
           </w:p>
@@ -2124,13 +1464,7 @@
             <w:vAlign w:val="center"/>
           </w:tcPr>
           <w:p>
-            <w:r/>
             <w:r>
-              <w:rPr>
-                <w:rFonts w:ascii="Times New Roman" w:hAnsi="Times New Roman"/>
-                <w:b w:val="0"/>
-                <w:sz w:val="20"/>
-              </w:rPr>
               <w:t>Да / Нет</w:t>
             </w:r>
           </w:p>
@@ -2143,13 +1477,7 @@
             <w:vAlign w:val="center"/>
           </w:tcPr>
           <w:p>
-            <w:r/>
             <w:r>
-              <w:rPr>
-                <w:rFonts w:ascii="Times New Roman" w:hAnsi="Times New Roman"/>
-                <w:b w:val="0"/>
-                <w:sz w:val="20"/>
-              </w:rPr>
               <w:t>37</w:t>
             </w:r>
           </w:p>
@@ -2160,13 +1488,7 @@
             <w:vAlign w:val="center"/>
           </w:tcPr>
           <w:p>
-            <w:r/>
             <w:r>
-              <w:rPr>
-                <w:rFonts w:ascii="Times New Roman" w:hAnsi="Times New Roman"/>
-                <w:b w:val="0"/>
-                <w:sz w:val="20"/>
-              </w:rPr>
               <w:t>Я предпочитаю уклоняться от конфликтов и затруднительных положений.</w:t>
             </w:r>
           </w:p>
@@ -2177,13 +1499,7 @@
             <w:vAlign w:val="center"/>
           </w:tcPr>
           <w:p>
-            <w:r/>
             <w:r>
-              <w:rPr>
-                <w:rFonts w:ascii="Times New Roman" w:hAnsi="Times New Roman"/>
-                <w:b w:val="0"/>
-                <w:sz w:val="20"/>
-              </w:rPr>
               <w:t>Да / Нет</w:t>
             </w:r>
           </w:p>
@@ -2196,13 +1512,7 @@
             <w:vAlign w:val="center"/>
           </w:tcPr>
           <w:p>
-            <w:r/>
             <w:r>
-              <w:rPr>
-                <w:rFonts w:ascii="Times New Roman" w:hAnsi="Times New Roman"/>
-                <w:b w:val="0"/>
-                <w:sz w:val="20"/>
-              </w:rPr>
               <w:t>38</w:t>
             </w:r>
           </w:p>
@@ -2213,13 +1523,7 @@
             <w:vAlign w:val="center"/>
           </w:tcPr>
           <w:p>
-            <w:r/>
             <w:r>
-              <w:rPr>
-                <w:rFonts w:ascii="Times New Roman" w:hAnsi="Times New Roman"/>
-                <w:b w:val="0"/>
-                <w:sz w:val="20"/>
-              </w:rPr>
               <w:t>У меня бывают приступы тошноты и рвоты.</w:t>
             </w:r>
           </w:p>
@@ -2230,13 +1534,7 @@
             <w:vAlign w:val="center"/>
           </w:tcPr>
           <w:p>
-            <w:r/>
             <w:r>
-              <w:rPr>
-                <w:rFonts w:ascii="Times New Roman" w:hAnsi="Times New Roman"/>
-                <w:b w:val="0"/>
-                <w:sz w:val="20"/>
-              </w:rPr>
               <w:t>Да / Нет</w:t>
             </w:r>
           </w:p>
@@ -2249,13 +1547,7 @@
             <w:vAlign w:val="center"/>
           </w:tcPr>
           <w:p>
-            <w:r/>
             <w:r>
-              <w:rPr>
-                <w:rFonts w:ascii="Times New Roman" w:hAnsi="Times New Roman"/>
-                <w:b w:val="0"/>
-                <w:sz w:val="20"/>
-              </w:rPr>
               <w:t>39</w:t>
             </w:r>
           </w:p>
@@ -2266,13 +1558,7 @@
             <w:vAlign w:val="center"/>
           </w:tcPr>
           <w:p>
-            <w:r/>
             <w:r>
-              <w:rPr>
-                <w:rFonts w:ascii="Times New Roman" w:hAnsi="Times New Roman"/>
-                <w:b w:val="0"/>
-                <w:sz w:val="20"/>
-              </w:rPr>
               <w:t>Я никогда не опаздываю на свидания или работу.</w:t>
             </w:r>
           </w:p>
@@ -2283,13 +1569,7 @@
             <w:vAlign w:val="center"/>
           </w:tcPr>
           <w:p>
-            <w:r/>
             <w:r>
-              <w:rPr>
-                <w:rFonts w:ascii="Times New Roman" w:hAnsi="Times New Roman"/>
-                <w:b w:val="0"/>
-                <w:sz w:val="20"/>
-              </w:rPr>
               <w:t>Да / Нет</w:t>
             </w:r>
           </w:p>
@@ -2302,13 +1582,7 @@
             <w:vAlign w:val="center"/>
           </w:tcPr>
           <w:p>
-            <w:r/>
             <w:r>
-              <w:rPr>
-                <w:rFonts w:ascii="Times New Roman" w:hAnsi="Times New Roman"/>
-                <w:b w:val="0"/>
-                <w:sz w:val="20"/>
-              </w:rPr>
               <w:t>40</w:t>
             </w:r>
           </w:p>
@@ -2319,13 +1593,7 @@
             <w:vAlign w:val="center"/>
           </w:tcPr>
           <w:p>
-            <w:r/>
             <w:r>
-              <w:rPr>
-                <w:rFonts w:ascii="Times New Roman" w:hAnsi="Times New Roman"/>
-                <w:b w:val="0"/>
-                <w:sz w:val="20"/>
-              </w:rPr>
               <w:t>Временами я определенно чувствую себя ненужным.</w:t>
             </w:r>
           </w:p>
@@ -2336,13 +1604,7 @@
             <w:vAlign w:val="center"/>
           </w:tcPr>
           <w:p>
-            <w:r/>
             <w:r>
-              <w:rPr>
-                <w:rFonts w:ascii="Times New Roman" w:hAnsi="Times New Roman"/>
-                <w:b w:val="0"/>
-                <w:sz w:val="20"/>
-              </w:rPr>
               <w:t>Да / Нет</w:t>
             </w:r>
           </w:p>
@@ -2355,13 +1617,7 @@
             <w:vAlign w:val="center"/>
           </w:tcPr>
           <w:p>
-            <w:r/>
             <w:r>
-              <w:rPr>
-                <w:rFonts w:ascii="Times New Roman" w:hAnsi="Times New Roman"/>
-                <w:b w:val="0"/>
-                <w:sz w:val="20"/>
-              </w:rPr>
               <w:t>41</w:t>
             </w:r>
           </w:p>
@@ -2372,13 +1628,7 @@
             <w:vAlign w:val="center"/>
           </w:tcPr>
           <w:p>
-            <w:r/>
             <w:r>
-              <w:rPr>
-                <w:rFonts w:ascii="Times New Roman" w:hAnsi="Times New Roman"/>
-                <w:b w:val="0"/>
-                <w:sz w:val="20"/>
-              </w:rPr>
               <w:t>Иногда мне хочется выругаться.</w:t>
             </w:r>
           </w:p>
@@ -2389,13 +1639,7 @@
             <w:vAlign w:val="center"/>
           </w:tcPr>
           <w:p>
-            <w:r/>
             <w:r>
-              <w:rPr>
-                <w:rFonts w:ascii="Times New Roman" w:hAnsi="Times New Roman"/>
-                <w:b w:val="0"/>
-                <w:sz w:val="20"/>
-              </w:rPr>
               <w:t>Да / Нет</w:t>
             </w:r>
           </w:p>
@@ -2408,13 +1652,7 @@
             <w:vAlign w:val="center"/>
           </w:tcPr>
           <w:p>
-            <w:r/>
             <w:r>
-              <w:rPr>
-                <w:rFonts w:ascii="Times New Roman" w:hAnsi="Times New Roman"/>
-                <w:b w:val="0"/>
-                <w:sz w:val="20"/>
-              </w:rPr>
               <w:t>42</w:t>
             </w:r>
           </w:p>
@@ -2425,13 +1663,7 @@
             <w:vAlign w:val="center"/>
           </w:tcPr>
           <w:p>
-            <w:r/>
             <w:r>
-              <w:rPr>
-                <w:rFonts w:ascii="Times New Roman" w:hAnsi="Times New Roman"/>
-                <w:b w:val="0"/>
-                <w:sz w:val="20"/>
-              </w:rPr>
               <w:t>Почти всегда я испытываю тревогу в связи с чем-либо или с кем-либо.</w:t>
             </w:r>
           </w:p>
@@ -2442,13 +1674,7 @@
             <w:vAlign w:val="center"/>
           </w:tcPr>
           <w:p>
-            <w:r/>
             <w:r>
-              <w:rPr>
-                <w:rFonts w:ascii="Times New Roman" w:hAnsi="Times New Roman"/>
-                <w:b w:val="0"/>
-                <w:sz w:val="20"/>
-              </w:rPr>
               <w:t>Да / Нет</w:t>
             </w:r>
           </w:p>
@@ -2461,13 +1687,7 @@
             <w:vAlign w:val="center"/>
           </w:tcPr>
           <w:p>
-            <w:r/>
             <w:r>
-              <w:rPr>
-                <w:rFonts w:ascii="Times New Roman" w:hAnsi="Times New Roman"/>
-                <w:b w:val="0"/>
-                <w:sz w:val="20"/>
-              </w:rPr>
               <w:t>43</w:t>
             </w:r>
           </w:p>
@@ -2478,13 +1698,7 @@
             <w:vAlign w:val="center"/>
           </w:tcPr>
           <w:p>
-            <w:r/>
             <w:r>
-              <w:rPr>
-                <w:rFonts w:ascii="Times New Roman" w:hAnsi="Times New Roman"/>
-                <w:b w:val="0"/>
-                <w:sz w:val="20"/>
-              </w:rPr>
               <w:t>Меня беспокоят возможные неудачи.</w:t>
             </w:r>
           </w:p>
@@ -2495,13 +1709,7 @@
             <w:vAlign w:val="center"/>
           </w:tcPr>
           <w:p>
-            <w:r/>
             <w:r>
-              <w:rPr>
-                <w:rFonts w:ascii="Times New Roman" w:hAnsi="Times New Roman"/>
-                <w:b w:val="0"/>
-                <w:sz w:val="20"/>
-              </w:rPr>
               <w:t>Да / Нет</w:t>
             </w:r>
           </w:p>
@@ -2514,13 +1722,7 @@
             <w:vAlign w:val="center"/>
           </w:tcPr>
           <w:p>
-            <w:r/>
             <w:r>
-              <w:rPr>
-                <w:rFonts w:ascii="Times New Roman" w:hAnsi="Times New Roman"/>
-                <w:b w:val="0"/>
-                <w:sz w:val="20"/>
-              </w:rPr>
               <w:t>44</w:t>
             </w:r>
           </w:p>
@@ -2531,13 +1733,7 @@
             <w:vAlign w:val="center"/>
           </w:tcPr>
           <w:p>
-            <w:r/>
             <w:r>
-              <w:rPr>
-                <w:rFonts w:ascii="Times New Roman" w:hAnsi="Times New Roman"/>
-                <w:b w:val="0"/>
-                <w:sz w:val="20"/>
-              </w:rPr>
               <w:t>Я часто боюсь, что вот-вот покраснею.</w:t>
             </w:r>
           </w:p>
@@ -2548,13 +1744,7 @@
             <w:vAlign w:val="center"/>
           </w:tcPr>
           <w:p>
-            <w:r/>
             <w:r>
-              <w:rPr>
-                <w:rFonts w:ascii="Times New Roman" w:hAnsi="Times New Roman"/>
-                <w:b w:val="0"/>
-                <w:sz w:val="20"/>
-              </w:rPr>
               <w:t>Да / Нет</w:t>
             </w:r>
           </w:p>
@@ -2567,13 +1757,7 @@
             <w:vAlign w:val="center"/>
           </w:tcPr>
           <w:p>
-            <w:r/>
             <w:r>
-              <w:rPr>
-                <w:rFonts w:ascii="Times New Roman" w:hAnsi="Times New Roman"/>
-                <w:b w:val="0"/>
-                <w:sz w:val="20"/>
-              </w:rPr>
               <w:t>45</w:t>
             </w:r>
           </w:p>
@@ -2584,13 +1768,7 @@
             <w:vAlign w:val="center"/>
           </w:tcPr>
           <w:p>
-            <w:r/>
             <w:r>
-              <w:rPr>
-                <w:rFonts w:ascii="Times New Roman" w:hAnsi="Times New Roman"/>
-                <w:b w:val="0"/>
-                <w:sz w:val="20"/>
-              </w:rPr>
               <w:t>Меня нередко охватывает отчаяние.</w:t>
             </w:r>
           </w:p>
@@ -2601,13 +1779,7 @@
             <w:vAlign w:val="center"/>
           </w:tcPr>
           <w:p>
-            <w:r/>
             <w:r>
-              <w:rPr>
-                <w:rFonts w:ascii="Times New Roman" w:hAnsi="Times New Roman"/>
-                <w:b w:val="0"/>
-                <w:sz w:val="20"/>
-              </w:rPr>
               <w:t>Да / Нет</w:t>
             </w:r>
           </w:p>
@@ -2620,13 +1792,7 @@
             <w:vAlign w:val="center"/>
           </w:tcPr>
           <w:p>
-            <w:r/>
             <w:r>
-              <w:rPr>
-                <w:rFonts w:ascii="Times New Roman" w:hAnsi="Times New Roman"/>
-                <w:b w:val="0"/>
-                <w:sz w:val="20"/>
-              </w:rPr>
               <w:t>46</w:t>
             </w:r>
           </w:p>
@@ -2637,13 +1803,7 @@
             <w:vAlign w:val="center"/>
           </w:tcPr>
           <w:p>
-            <w:r/>
             <w:r>
-              <w:rPr>
-                <w:rFonts w:ascii="Times New Roman" w:hAnsi="Times New Roman"/>
-                <w:b w:val="0"/>
-                <w:sz w:val="20"/>
-              </w:rPr>
               <w:t>Я - человек нервный и легко возбудимый.</w:t>
             </w:r>
           </w:p>
@@ -2654,13 +1814,7 @@
             <w:vAlign w:val="center"/>
           </w:tcPr>
           <w:p>
-            <w:r/>
             <w:r>
-              <w:rPr>
-                <w:rFonts w:ascii="Times New Roman" w:hAnsi="Times New Roman"/>
-                <w:b w:val="0"/>
-                <w:sz w:val="20"/>
-              </w:rPr>
               <w:t>Да / Нет</w:t>
             </w:r>
           </w:p>
@@ -2673,13 +1827,7 @@
             <w:vAlign w:val="center"/>
           </w:tcPr>
           <w:p>
-            <w:r/>
             <w:r>
-              <w:rPr>
-                <w:rFonts w:ascii="Times New Roman" w:hAnsi="Times New Roman"/>
-                <w:b w:val="0"/>
-                <w:sz w:val="20"/>
-              </w:rPr>
               <w:t>47</w:t>
             </w:r>
           </w:p>
@@ -2690,13 +1838,7 @@
             <w:vAlign w:val="center"/>
           </w:tcPr>
           <w:p>
-            <w:r/>
             <w:r>
-              <w:rPr>
-                <w:rFonts w:ascii="Times New Roman" w:hAnsi="Times New Roman"/>
-                <w:b w:val="0"/>
-                <w:sz w:val="20"/>
-              </w:rPr>
               <w:t>Я часто замечаю, что мои руки дрожат, когда я пытаюсь что-нибудь сделать.</w:t>
             </w:r>
           </w:p>
@@ -2707,13 +1849,7 @@
             <w:vAlign w:val="center"/>
           </w:tcPr>
           <w:p>
-            <w:r/>
             <w:r>
-              <w:rPr>
-                <w:rFonts w:ascii="Times New Roman" w:hAnsi="Times New Roman"/>
-                <w:b w:val="0"/>
-                <w:sz w:val="20"/>
-              </w:rPr>
               <w:t>Да / Нет</w:t>
             </w:r>
           </w:p>
@@ -2726,13 +1862,7 @@
             <w:vAlign w:val="center"/>
           </w:tcPr>
           <w:p>
-            <w:r/>
             <w:r>
-              <w:rPr>
-                <w:rFonts w:ascii="Times New Roman" w:hAnsi="Times New Roman"/>
-                <w:b w:val="0"/>
-                <w:sz w:val="20"/>
-              </w:rPr>
               <w:t>48</w:t>
             </w:r>
           </w:p>
@@ -2743,13 +1873,7 @@
             <w:vAlign w:val="center"/>
           </w:tcPr>
           <w:p>
-            <w:r/>
             <w:r>
-              <w:rPr>
-                <w:rFonts w:ascii="Times New Roman" w:hAnsi="Times New Roman"/>
-                <w:b w:val="0"/>
-                <w:sz w:val="20"/>
-              </w:rPr>
               <w:t>Я почти всегда испытываю чувство голода.</w:t>
             </w:r>
           </w:p>
@@ -2760,13 +1884,7 @@
             <w:vAlign w:val="center"/>
           </w:tcPr>
           <w:p>
-            <w:r/>
             <w:r>
-              <w:rPr>
-                <w:rFonts w:ascii="Times New Roman" w:hAnsi="Times New Roman"/>
-                <w:b w:val="0"/>
-                <w:sz w:val="20"/>
-              </w:rPr>
               <w:t>Да / Нет</w:t>
             </w:r>
           </w:p>
@@ -2779,13 +1897,7 @@
             <w:vAlign w:val="center"/>
           </w:tcPr>
           <w:p>
-            <w:r/>
             <w:r>
-              <w:rPr>
-                <w:rFonts w:ascii="Times New Roman" w:hAnsi="Times New Roman"/>
-                <w:b w:val="0"/>
-                <w:sz w:val="20"/>
-              </w:rPr>
               <w:t>49</w:t>
             </w:r>
           </w:p>
@@ -2796,13 +1908,7 @@
             <w:vAlign w:val="center"/>
           </w:tcPr>
           <w:p>
-            <w:r/>
             <w:r>
-              <w:rPr>
-                <w:rFonts w:ascii="Times New Roman" w:hAnsi="Times New Roman"/>
-                <w:b w:val="0"/>
-                <w:sz w:val="20"/>
-              </w:rPr>
               <w:t>Мне не хватает уверенности в себе.</w:t>
             </w:r>
           </w:p>
@@ -2813,13 +1919,7 @@
             <w:vAlign w:val="center"/>
           </w:tcPr>
           <w:p>
-            <w:r/>
             <w:r>
-              <w:rPr>
-                <w:rFonts w:ascii="Times New Roman" w:hAnsi="Times New Roman"/>
-                <w:b w:val="0"/>
-                <w:sz w:val="20"/>
-              </w:rPr>
               <w:t>Да / Нет</w:t>
             </w:r>
           </w:p>
@@ -2832,13 +1932,7 @@
             <w:vAlign w:val="center"/>
           </w:tcPr>
           <w:p>
-            <w:r/>
             <w:r>
-              <w:rPr>
-                <w:rFonts w:ascii="Times New Roman" w:hAnsi="Times New Roman"/>
-                <w:b w:val="0"/>
-                <w:sz w:val="20"/>
-              </w:rPr>
               <w:t>50</w:t>
             </w:r>
           </w:p>
@@ -2849,13 +1943,7 @@
             <w:vAlign w:val="center"/>
           </w:tcPr>
           <w:p>
-            <w:r/>
             <w:r>
-              <w:rPr>
-                <w:rFonts w:ascii="Times New Roman" w:hAnsi="Times New Roman"/>
-                <w:b w:val="0"/>
-                <w:sz w:val="20"/>
-              </w:rPr>
               <w:t>Я легко потею даже в прохладные дни.</w:t>
             </w:r>
           </w:p>
@@ -2866,13 +1954,7 @@
             <w:vAlign w:val="center"/>
           </w:tcPr>
           <w:p>
-            <w:r/>
             <w:r>
-              <w:rPr>
-                <w:rFonts w:ascii="Times New Roman" w:hAnsi="Times New Roman"/>
-                <w:b w:val="0"/>
-                <w:sz w:val="20"/>
-              </w:rPr>
               <w:t>Да / Нет</w:t>
             </w:r>
           </w:p>
@@ -2885,13 +1967,7 @@
             <w:vAlign w:val="center"/>
           </w:tcPr>
           <w:p>
-            <w:r/>
             <w:r>
-              <w:rPr>
-                <w:rFonts w:ascii="Times New Roman" w:hAnsi="Times New Roman"/>
-                <w:b w:val="0"/>
-                <w:sz w:val="20"/>
-              </w:rPr>
               <w:t>51</w:t>
             </w:r>
           </w:p>
@@ -2902,13 +1978,7 @@
             <w:vAlign w:val="center"/>
           </w:tcPr>
           <w:p>
-            <w:r/>
             <w:r>
-              <w:rPr>
-                <w:rFonts w:ascii="Times New Roman" w:hAnsi="Times New Roman"/>
-                <w:b w:val="0"/>
-                <w:sz w:val="20"/>
-              </w:rPr>
               <w:t>Я часто мечтаю о таких вещах, о которых лучше никому не рассказывать.</w:t>
             </w:r>
           </w:p>
@@ -2919,13 +1989,7 @@
             <w:vAlign w:val="center"/>
           </w:tcPr>
           <w:p>
-            <w:r/>
             <w:r>
-              <w:rPr>
-                <w:rFonts w:ascii="Times New Roman" w:hAnsi="Times New Roman"/>
-                <w:b w:val="0"/>
-                <w:sz w:val="20"/>
-              </w:rPr>
               <w:t>Да / Нет</w:t>
             </w:r>
           </w:p>
@@ -2938,13 +2002,7 @@
             <w:vAlign w:val="center"/>
           </w:tcPr>
           <w:p>
-            <w:r/>
             <w:r>
-              <w:rPr>
-                <w:rFonts w:ascii="Times New Roman" w:hAnsi="Times New Roman"/>
-                <w:b w:val="0"/>
-                <w:sz w:val="20"/>
-              </w:rPr>
               <w:t>52</w:t>
             </w:r>
           </w:p>
@@ -2955,13 +2013,7 @@
             <w:vAlign w:val="center"/>
           </w:tcPr>
           <w:p>
-            <w:r/>
             <w:r>
-              <w:rPr>
-                <w:rFonts w:ascii="Times New Roman" w:hAnsi="Times New Roman"/>
-                <w:b w:val="0"/>
-                <w:sz w:val="20"/>
-              </w:rPr>
               <w:t>У меня очень редко болит живот.</w:t>
             </w:r>
           </w:p>
@@ -2972,13 +2024,7 @@
             <w:vAlign w:val="center"/>
           </w:tcPr>
           <w:p>
-            <w:r/>
             <w:r>
-              <w:rPr>
-                <w:rFonts w:ascii="Times New Roman" w:hAnsi="Times New Roman"/>
-                <w:b w:val="0"/>
-                <w:sz w:val="20"/>
-              </w:rPr>
               <w:t>Да / Нет</w:t>
             </w:r>
           </w:p>
@@ -2991,13 +2037,7 @@
             <w:vAlign w:val="center"/>
           </w:tcPr>
           <w:p>
-            <w:r/>
             <w:r>
-              <w:rPr>
-                <w:rFonts w:ascii="Times New Roman" w:hAnsi="Times New Roman"/>
-                <w:b w:val="0"/>
-                <w:sz w:val="20"/>
-              </w:rPr>
               <w:t>53</w:t>
             </w:r>
           </w:p>
@@ -3008,13 +2048,7 @@
             <w:vAlign w:val="center"/>
           </w:tcPr>
           <w:p>
-            <w:r/>
             <w:r>
-              <w:rPr>
-                <w:rFonts w:ascii="Times New Roman" w:hAnsi="Times New Roman"/>
-                <w:b w:val="0"/>
-                <w:sz w:val="20"/>
-              </w:rPr>
               <w:t>Я считаю, что мне очень трудно сосредоточиться на какой-либо задаче или работе.</w:t>
             </w:r>
           </w:p>
@@ -3025,13 +2059,7 @@
             <w:vAlign w:val="center"/>
           </w:tcPr>
           <w:p>
-            <w:r/>
             <w:r>
-              <w:rPr>
-                <w:rFonts w:ascii="Times New Roman" w:hAnsi="Times New Roman"/>
-                <w:b w:val="0"/>
-                <w:sz w:val="20"/>
-              </w:rPr>
               <w:t>Да / Нет</w:t>
             </w:r>
           </w:p>
@@ -3044,13 +2072,7 @@
             <w:vAlign w:val="center"/>
           </w:tcPr>
           <w:p>
-            <w:r/>
             <w:r>
-              <w:rPr>
-                <w:rFonts w:ascii="Times New Roman" w:hAnsi="Times New Roman"/>
-                <w:b w:val="0"/>
-                <w:sz w:val="20"/>
-              </w:rPr>
               <w:t>54</w:t>
             </w:r>
           </w:p>
@@ -3061,13 +2083,7 @@
             <w:vAlign w:val="center"/>
           </w:tcPr>
           <w:p>
-            <w:r/>
             <w:r>
-              <w:rPr>
-                <w:rFonts w:ascii="Times New Roman" w:hAnsi="Times New Roman"/>
-                <w:b w:val="0"/>
-                <w:sz w:val="20"/>
-              </w:rPr>
               <w:t>У меня бывают периоды такого сильного беспокойства, что я не могу долго усидеть на одном месте.</w:t>
             </w:r>
           </w:p>
@@ -3078,13 +2094,7 @@
             <w:vAlign w:val="center"/>
           </w:tcPr>
           <w:p>
-            <w:r/>
             <w:r>
-              <w:rPr>
-                <w:rFonts w:ascii="Times New Roman" w:hAnsi="Times New Roman"/>
-                <w:b w:val="0"/>
-                <w:sz w:val="20"/>
-              </w:rPr>
               <w:t>Да / Нет</w:t>
             </w:r>
           </w:p>
@@ -3097,13 +2107,7 @@
             <w:vAlign w:val="center"/>
           </w:tcPr>
           <w:p>
-            <w:r/>
             <w:r>
-              <w:rPr>
-                <w:rFonts w:ascii="Times New Roman" w:hAnsi="Times New Roman"/>
-                <w:b w:val="0"/>
-                <w:sz w:val="20"/>
-              </w:rPr>
               <w:t>55</w:t>
             </w:r>
           </w:p>
@@ -3114,13 +2118,7 @@
             <w:vAlign w:val="center"/>
           </w:tcPr>
           <w:p>
-            <w:r/>
             <w:r>
-              <w:rPr>
-                <w:rFonts w:ascii="Times New Roman" w:hAnsi="Times New Roman"/>
-                <w:b w:val="0"/>
-                <w:sz w:val="20"/>
-              </w:rPr>
               <w:t>Я всегда отвечаю на письма сразу же после прочтения.</w:t>
             </w:r>
           </w:p>
@@ -3131,13 +2129,7 @@
             <w:vAlign w:val="center"/>
           </w:tcPr>
           <w:p>
-            <w:r/>
             <w:r>
-              <w:rPr>
-                <w:rFonts w:ascii="Times New Roman" w:hAnsi="Times New Roman"/>
-                <w:b w:val="0"/>
-                <w:sz w:val="20"/>
-              </w:rPr>
               <w:t>Да / Нет</w:t>
             </w:r>
           </w:p>
@@ -3150,13 +2142,7 @@
             <w:vAlign w:val="center"/>
           </w:tcPr>
           <w:p>
-            <w:r/>
             <w:r>
-              <w:rPr>
-                <w:rFonts w:ascii="Times New Roman" w:hAnsi="Times New Roman"/>
-                <w:b w:val="0"/>
-                <w:sz w:val="20"/>
-              </w:rPr>
               <w:t>56</w:t>
             </w:r>
           </w:p>
@@ -3167,13 +2153,7 @@
             <w:vAlign w:val="center"/>
           </w:tcPr>
           <w:p>
-            <w:r/>
             <w:r>
-              <w:rPr>
-                <w:rFonts w:ascii="Times New Roman" w:hAnsi="Times New Roman"/>
-                <w:b w:val="0"/>
-                <w:sz w:val="20"/>
-              </w:rPr>
               <w:t>Я легко расстраиваюсь.</w:t>
             </w:r>
           </w:p>
@@ -3184,13 +2164,7 @@
             <w:vAlign w:val="center"/>
           </w:tcPr>
           <w:p>
-            <w:r/>
             <w:r>
-              <w:rPr>
-                <w:rFonts w:ascii="Times New Roman" w:hAnsi="Times New Roman"/>
-                <w:b w:val="0"/>
-                <w:sz w:val="20"/>
-              </w:rPr>
               <w:t>Да / Нет</w:t>
             </w:r>
           </w:p>
@@ -3203,13 +2177,7 @@
             <w:vAlign w:val="center"/>
           </w:tcPr>
           <w:p>
-            <w:r/>
             <w:r>
-              <w:rPr>
-                <w:rFonts w:ascii="Times New Roman" w:hAnsi="Times New Roman"/>
-                <w:b w:val="0"/>
-                <w:sz w:val="20"/>
-              </w:rPr>
               <w:t>57</w:t>
             </w:r>
           </w:p>
@@ -3220,13 +2188,7 @@
             <w:vAlign w:val="center"/>
           </w:tcPr>
           <w:p>
-            <w:r/>
             <w:r>
-              <w:rPr>
-                <w:rFonts w:ascii="Times New Roman" w:hAnsi="Times New Roman"/>
-                <w:b w:val="0"/>
-                <w:sz w:val="20"/>
-              </w:rPr>
               <w:t>Я практически никогда не краснею.</w:t>
             </w:r>
           </w:p>
@@ -3237,13 +2199,7 @@
             <w:vAlign w:val="center"/>
           </w:tcPr>
           <w:p>
-            <w:r/>
             <w:r>
-              <w:rPr>
-                <w:rFonts w:ascii="Times New Roman" w:hAnsi="Times New Roman"/>
-                <w:b w:val="0"/>
-                <w:sz w:val="20"/>
-              </w:rPr>
               <w:t>Да / Нет</w:t>
             </w:r>
           </w:p>
@@ -3256,13 +2212,7 @@
             <w:vAlign w:val="center"/>
           </w:tcPr>
           <w:p>
-            <w:r/>
             <w:r>
-              <w:rPr>
-                <w:rFonts w:ascii="Times New Roman" w:hAnsi="Times New Roman"/>
-                <w:b w:val="0"/>
-                <w:sz w:val="20"/>
-              </w:rPr>
               <w:t>58</w:t>
             </w:r>
           </w:p>
@@ -3273,13 +2223,7 @@
             <w:vAlign w:val="center"/>
           </w:tcPr>
           <w:p>
-            <w:r/>
             <w:r>
-              <w:rPr>
-                <w:rFonts w:ascii="Times New Roman" w:hAnsi="Times New Roman"/>
-                <w:b w:val="0"/>
-                <w:sz w:val="20"/>
-              </w:rPr>
               <w:t>У меня гораздо меньше различных опасений и страхов, чем у моих друзей и знакомых.</w:t>
             </w:r>
           </w:p>
@@ -3290,13 +2234,7 @@
             <w:vAlign w:val="center"/>
           </w:tcPr>
           <w:p>
-            <w:r/>
             <w:r>
-              <w:rPr>
-                <w:rFonts w:ascii="Times New Roman" w:hAnsi="Times New Roman"/>
-                <w:b w:val="0"/>
-                <w:sz w:val="20"/>
-              </w:rPr>
               <w:t>Да / Нет</w:t>
             </w:r>
           </w:p>
@@ -3309,13 +2247,7 @@
             <w:vAlign w:val="center"/>
           </w:tcPr>
           <w:p>
-            <w:r/>
             <w:r>
-              <w:rPr>
-                <w:rFonts w:ascii="Times New Roman" w:hAnsi="Times New Roman"/>
-                <w:b w:val="0"/>
-                <w:sz w:val="20"/>
-              </w:rPr>
               <w:t>59</w:t>
             </w:r>
           </w:p>
@@ -3326,13 +2258,7 @@
             <w:vAlign w:val="center"/>
           </w:tcPr>
           <w:p>
-            <w:r/>
             <w:r>
-              <w:rPr>
-                <w:rFonts w:ascii="Times New Roman" w:hAnsi="Times New Roman"/>
-                <w:b w:val="0"/>
-                <w:sz w:val="20"/>
-              </w:rPr>
               <w:t>Бывает, что я откладываю на завтра то, что следует сделать сегодня.</w:t>
             </w:r>
           </w:p>
@@ -3343,13 +2269,7 @@
             <w:vAlign w:val="center"/>
           </w:tcPr>
           <w:p>
-            <w:r/>
             <w:r>
-              <w:rPr>
-                <w:rFonts w:ascii="Times New Roman" w:hAnsi="Times New Roman"/>
-                <w:b w:val="0"/>
-                <w:sz w:val="20"/>
-              </w:rPr>
               <w:t>Да / Нет</w:t>
             </w:r>
           </w:p>
@@ -3362,13 +2282,7 @@
             <w:vAlign w:val="center"/>
           </w:tcPr>
           <w:p>
-            <w:r/>
             <w:r>
-              <w:rPr>
-                <w:rFonts w:ascii="Times New Roman" w:hAnsi="Times New Roman"/>
-                <w:b w:val="0"/>
-                <w:sz w:val="20"/>
-              </w:rPr>
               <w:t>60</w:t>
             </w:r>
           </w:p>
@@ -3379,13 +2293,7 @@
             <w:vAlign w:val="center"/>
           </w:tcPr>
           <w:p>
-            <w:r/>
             <w:r>
-              <w:rPr>
-                <w:rFonts w:ascii="Times New Roman" w:hAnsi="Times New Roman"/>
-                <w:b w:val="0"/>
-                <w:sz w:val="20"/>
-              </w:rPr>
               <w:t>Обычно я работаю с большим напряжением.</w:t>
             </w:r>
           </w:p>
@@ -3396,13 +2304,7 @@
             <w:vAlign w:val="center"/>
           </w:tcPr>
           <w:p>
-            <w:r/>
             <w:r>
-              <w:rPr>
-                <w:rFonts w:ascii="Times New Roman" w:hAnsi="Times New Roman"/>
-                <w:b w:val="0"/>
-                <w:sz w:val="20"/>
-              </w:rPr>
               <w:t>Да / Нет</w:t>
             </w:r>
           </w:p>
@@ -3415,6 +2317,113 @@
         <w:t>Адрес размещения теста: https://docs.google.com/forms/d/e/1FAIpQLScvyQ4Vzx3cxv3eQUqYjEYiqod6y7ALnRlsZYiTavVku9sEsA/viewform</w:t>
       </w:r>
     </w:p>
+    <w:p>
+      <w:pPr>
+        <w:pStyle w:val="Heading1"/>
+      </w:pPr>
+      <w:r>
+        <w:t>Сводка реальных результатов</w:t>
+      </w:r>
+    </w:p>
+    <w:tbl>
+      <w:tblPr>
+        <w:tblStyle w:val="TableGrid"/>
+        <w:tblW w:type="auto" w:w="0"/>
+        <w:tblLook w:firstColumn="1" w:firstRow="1" w:lastColumn="0" w:lastRow="0" w:noHBand="0" w:noVBand="1" w:val="04A0"/>
+      </w:tblPr>
+      <w:tblGrid>
+        <w:gridCol w:w="5128"/>
+        <w:gridCol w:w="5128"/>
+      </w:tblGrid>
+      <w:tr>
+        <w:tc>
+          <w:tcPr>
+            <w:tcW w:type="dxa" w:w="5128"/>
+          </w:tcPr>
+          <w:p>
+            <w:r>
+              <w:t>Показатель</w:t>
+            </w:r>
+          </w:p>
+        </w:tc>
+        <w:tc>
+          <w:tcPr>
+            <w:tcW w:type="dxa" w:w="5128"/>
+          </w:tcPr>
+          <w:p>
+            <w:r>
+              <w:t>Значение</w:t>
+            </w:r>
+          </w:p>
+        </w:tc>
+      </w:tr>
+      <w:tr>
+        <w:tc>
+          <w:tcPr>
+            <w:tcW w:type="dxa" w:w="5128"/>
+          </w:tcPr>
+          <w:p>
+            <w:r>
+              <w:t>Респондент 1</w:t>
+            </w:r>
+          </w:p>
+        </w:tc>
+        <w:tc>
+          <w:tcPr>
+            <w:tcW w:type="dxa" w:w="5128"/>
+          </w:tcPr>
+          <w:p>
+            <w:r>
+              <w:t>18 баллов; контроль 2; средний уровень тревоги с тенденцией к высокому</w:t>
+            </w:r>
+          </w:p>
+        </w:tc>
+      </w:tr>
+      <w:tr>
+        <w:tc>
+          <w:tcPr>
+            <w:tcW w:type="dxa" w:w="5128"/>
+          </w:tcPr>
+          <w:p>
+            <w:r>
+              <w:t>Респондент 2</w:t>
+            </w:r>
+          </w:p>
+        </w:tc>
+        <w:tc>
+          <w:tcPr>
+            <w:tcW w:type="dxa" w:w="5128"/>
+          </w:tcPr>
+          <w:p>
+            <w:r>
+              <w:t>31 балл; контроль 4; высокий уровень тревоги</w:t>
+            </w:r>
+          </w:p>
+        </w:tc>
+      </w:tr>
+      <w:tr>
+        <w:tc>
+          <w:tcPr>
+            <w:tcW w:type="dxa" w:w="5128"/>
+          </w:tcPr>
+          <w:p>
+            <w:r>
+              <w:t>Респондент 3</w:t>
+            </w:r>
+          </w:p>
+        </w:tc>
+        <w:tc>
+          <w:tcPr>
+            <w:tcW w:type="dxa" w:w="5128"/>
+          </w:tcPr>
+          <w:p>
+            <w:r>
+              <w:t>29 баллов; контроль 6; высокий уровень тревоги; результаты могут быть недостоверными</w:t>
+            </w:r>
+          </w:p>
+        </w:tc>
+      </w:tr>
+    </w:tbl>
     <w:sectPr>
       <w:pgSz w:w="12240" w:h="15840"/>
       <w:pgMar w:top="1020" w:right="850" w:bottom="1020" w:left="1134" w:header="720" w:footer="720" w:gutter="0"/>

</xml_diff>

<commit_message>
Polish final submission package
</commit_message>
<xml_diff>
--- a/Психологический_центр_готово/08_Практика_7_Анкетирование/Практика7_Анкетирование_отчет.docx
+++ b/Психологический_центр_готово/08_Практика_7_Анкетирование/Практика7_Анкетирование_отчет.docx
@@ -85,7 +85,7 @@
     </w:p>
     <w:p>
       <w:r>
-        <w:t>Онлайн-тест «Уровень тревожности» переносится в Google Forms. Каждый вопрос обязателен, варианты ответов: «Да» и «Нет».</w:t>
+        <w:t>Онлайн-тест «Уровень тревожности» перенесен в Google Forms. Каждый вопрос сделан обязательным, варианты ответов: «Да» и «Нет».</w:t>
       </w:r>
     </w:p>
     <w:p>
@@ -93,11 +93,7 @@
         <w:pStyle w:val="Heading1"/>
       </w:pPr>
       <w:r>
-        <w:rPr>
-          <w:rFonts w:ascii="Times New Roman" w:hAnsi="Times New Roman"/>
-          <w:color w:val="264E52"/>
-        </w:rPr>
-        <w:t>Инструкция переноса в Google Forms</w:t>
+        <w:t>Описание выполненной работы в Google Forms</w:t>
       </w:r>
     </w:p>
     <w:p>
@@ -105,7 +101,7 @@
         <w:pStyle w:val="ListNumber"/>
       </w:pPr>
       <w:r>
-        <w:t>Создать новую форму с названием «Уровень тревожности».</w:t>
+        <w:t>Создана новая форма с названием «Уровень тревожности».</w:t>
       </w:r>
     </w:p>
     <w:p>
@@ -113,7 +109,7 @@
         <w:pStyle w:val="ListNumber"/>
       </w:pPr>
       <w:r>
-        <w:t>Добавить вопросы из файла со структурой теста, тип каждого вопроса - один из списка.</w:t>
+        <w:t>В форму внесены все вопросы методики; тип каждого вопроса - один из списка.</w:t>
       </w:r>
     </w:p>
     <w:p>
@@ -121,7 +117,7 @@
         <w:pStyle w:val="ListNumber"/>
       </w:pPr>
       <w:r>
-        <w:t>Для каждого вопроса включить обязательный ответ.</w:t>
+        <w:t>Для каждого вопроса включен обязательный ответ.</w:t>
       </w:r>
     </w:p>
     <w:p>
@@ -129,7 +125,7 @@
         <w:pStyle w:val="ListNumber"/>
       </w:pPr>
       <w:r>
-        <w:t>В настройках теста указать начисление баллов согласно ключу.</w:t>
+        <w:t>В настройках теста задано начисление баллов согласно ключу.</w:t>
       </w:r>
     </w:p>
     <w:p>
@@ -137,7 +133,7 @@
         <w:pStyle w:val="ListNumber"/>
       </w:pPr>
       <w:r>
-        <w:t>Опубликовать форму и вставить ссылку: https://docs.google.com/forms/d/e/1FAIpQLScvyQ4Vzx3cxv3eQUqYjEYiqod6y7ALnRlsZYiTavVku9sEsA/viewform.</w:t>
+        <w:t>Форма опубликована по ссылке: https://docs.google.com/forms/d/e/1FAIpQLScvyQ4Vzx3cxv3eQUqYjEYiqod6y7ALnRlsZYiTavVku9sEsA/viewform.</w:t>
       </w:r>
     </w:p>
     <w:p>

</xml_diff>